<commit_message>
feat: scrapers ofertasdepadel, padelproshop, zonadepadel + workflows + docs actualizados
</commit_message>
<xml_diff>
--- a/chollo-padel-fase2-v2/HUNTPADEL-proyecto.docx
+++ b/chollo-padel-fase2-v2/HUNTPADEL-proyecto.docx
@@ -33,7 +33,7 @@
           <w:sz w:val="20"/>
           <w:szCs w:val="20"/>
         </w:rPr>
-        <w:t xml:space="preserve">Living Document  ·  Última actualización: 2026-05-18  |  huntpadel.com</w:t>
+        <w:t xml:space="preserve">Living Document  ·  Última actualización: 2026-05-26  |  huntpadel.com</w:t>
       </w:r>
     </w:p>
     <w:p>
@@ -1280,7 +1280,7 @@
                 <w:sz w:val="20"/>
                 <w:szCs w:val="20"/>
               </w:rPr>
-              <w:t xml:space="preserve">Cada hora a :00. TTL 30 días. Verificación agresiva. matchPalaIds() al final.</w:t>
+              <w:t xml:space="preserve">Cada hora a :00. TTL 30 días. Vendidos=borrar inmediato. Reservados=3 días margen. matchPalaIds() al final.</w:t>
             </w:r>
           </w:p>
         </w:tc>
@@ -1531,28 +1531,28 @@
                 <w:sz w:val="20"/>
                 <w:szCs w:val="20"/>
               </w:rPr>
-              <w:t xml:space="preserve">⚠️</w:t>
-            </w:r>
-          </w:p>
-        </w:tc>
-        <w:tc>
-          <w:tcPr>
-            <w:shd w:fill="auto" w:color="auto" w:val="clear"/>
-          </w:tcPr>
-          <w:p>
-            <w:pPr>
-              <w:spacing w:after="0"/>
-            </w:pPr>
-            <w:r>
-              <w:rPr>
-                <w:rFonts w:ascii="Arial" w:cs="Arial" w:eastAsia="Arial" w:hAnsi="Arial"/>
-                <w:b w:val="false"/>
-                <w:bCs w:val="false"/>
-                <w:color w:val="000000"/>
-                <w:sz w:val="20"/>
-                <w:szCs w:val="20"/>
-              </w:rPr>
-              <w:t xml:space="preserve">Solo Padel Nuestro + Padelful. Pendiente más tiendas</w:t>
+              <w:t xml:space="preserve">✅</w:t>
+            </w:r>
+          </w:p>
+        </w:tc>
+        <w:tc>
+          <w:tcPr>
+            <w:shd w:fill="auto" w:color="auto" w:val="clear"/>
+          </w:tcPr>
+          <w:p>
+            <w:pPr>
+              <w:spacing w:after="0"/>
+            </w:pPr>
+            <w:r>
+              <w:rPr>
+                <w:rFonts w:ascii="Arial" w:cs="Arial" w:eastAsia="Arial" w:hAnsi="Arial"/>
+                <w:b w:val="false"/>
+                <w:bCs w:val="false"/>
+                <w:color w:val="000000"/>
+                <w:sz w:val="20"/>
+                <w:szCs w:val="20"/>
+              </w:rPr>
+              <w:t xml:space="preserve">10 tiendas configuradas (4 activas + 6 nuevas sesión 5: tennispoint, decathlon, padelproshop, miravia, amazon, padeliberico). pipeline.js v6 + fuzzy-matcher.js v5. Scripts scrapers creados, workflow scrape-precios.yml actualizado, price_sources insertados. Primer scrape de las 6 nuevas pendiente de verificar.</w:t>
             </w:r>
           </w:p>
         </w:tc>
@@ -1620,7 +1620,7 @@
                 <w:sz w:val="20"/>
                 <w:szCs w:val="20"/>
               </w:rPr>
-              <w:t xml:space="preserve">ACTUALIZADO 2026-05-18. Cobertura: ~757/1672 (~45%). Solo 2 ambiguos restantes. Automático en cada scrape.</w:t>
+              <w:t xml:space="preserve">ACTUALIZADO 2026-05-26 v16. Colores añadidos como diferenciadores (black, blue, grey, white, red…). Cobertura: ~757/1672 (~45%). Automático en cada scrape.</w:t>
             </w:r>
           </w:p>
         </w:tc>
@@ -1735,28 +1735,28 @@
                 <w:sz w:val="20"/>
                 <w:szCs w:val="20"/>
               </w:rPr>
-              <w:t xml:space="preserve">⚠️</w:t>
-            </w:r>
-          </w:p>
-        </w:tc>
-        <w:tc>
-          <w:tcPr>
-            <w:shd w:fill="auto" w:color="auto" w:val="clear"/>
-          </w:tcPr>
-          <w:p>
-            <w:pPr>
-              <w:spacing w:after="0"/>
-            </w:pPr>
-            <w:r>
-              <w:rPr>
-                <w:rFonts w:ascii="Arial" w:cs="Arial" w:eastAsia="Arial" w:hAnsi="Arial"/>
-                <w:b w:val="false"/>
-                <w:bCs w:val="false"/>
-                <w:color w:val="000000"/>
-                <w:sz w:val="20"/>
-                <w:szCs w:val="20"/>
-              </w:rPr>
-              <w:t xml:space="preserve">Placeholder limpio — rehaciendo con nuevo sistema de scrapers de tiendas</w:t>
+              <w:t xml:space="preserve">✅</w:t>
+            </w:r>
+          </w:p>
+        </w:tc>
+        <w:tc>
+          <w:tcPr>
+            <w:shd w:fill="auto" w:color="auto" w:val="clear"/>
+          </w:tcPr>
+          <w:p>
+            <w:pPr>
+              <w:spacing w:after="0"/>
+            </w:pPr>
+            <w:r>
+              <w:rPr>
+                <w:rFonts w:ascii="Arial" w:cs="Arial" w:eastAsia="Arial" w:hAnsi="Arial"/>
+                <w:b w:val="false"/>
+                <w:bCs w:val="false"/>
+                <w:color w:val="000000"/>
+                <w:sz w:val="20"/>
+                <w:szCs w:val="20"/>
+              </w:rPr>
+              <w:t xml:space="preserve">Funcionando con 4 guardias calidad (A+B+C+D en route.ts sesión 3). pipeline.js v6: verificación HTTP disponible=false para URLs rotas. fuzzy-matcher.js v5: señales de URL (sufijos año/versión) integradas en matching. Caché con invalidación por URL. Sesión 5: duplicados en TOP eliminados (MAX_POR_PALA_ID=1), filtro precio mínimo 15€, imagen rota Tecnifibre corregida. Sin pendientes de calidad de datos conocidos.</w:t>
             </w:r>
           </w:p>
         </w:tc>
@@ -1892,7 +1892,75 @@
                 <w:sz w:val="20"/>
                 <w:szCs w:val="20"/>
               </w:rPr>
-              <w:t xml:space="preserve">Funcionando. Top 10 generado cada hora.</w:t>
+              <w:t xml:space="preserve">Funcionando. Top 10 generado cada hora. Sesión 5: duplicados eliminados (MAX_POR_PALA_ID=1), basura italiana filtrada, precio mínimo 15€.</w:t>
+            </w:r>
+          </w:p>
+        </w:tc>
+      </w:tr>
+      <w:tr>
+        <w:trPr>
+          <w:tblHeader w:val="false"/>
+        </w:trPr>
+        <w:tc>
+          <w:tcPr>
+            <w:shd w:fill="auto" w:color="auto" w:val="clear"/>
+          </w:tcPr>
+          <w:p>
+            <w:pPr>
+              <w:spacing w:after="0"/>
+            </w:pPr>
+            <w:r>
+              <w:rPr>
+                <w:rFonts w:ascii="Arial" w:cs="Arial" w:eastAsia="Arial" w:hAnsi="Arial"/>
+                <w:b w:val="false"/>
+                <w:bCs w:val="false"/>
+                <w:color w:val="000000"/>
+                <w:sz w:val="20"/>
+                <w:szCs w:val="20"/>
+              </w:rPr>
+              <w:t xml:space="preserve">Seguridad BD</w:t>
+            </w:r>
+          </w:p>
+        </w:tc>
+        <w:tc>
+          <w:tcPr>
+            <w:shd w:fill="auto" w:color="auto" w:val="clear"/>
+          </w:tcPr>
+          <w:p>
+            <w:pPr>
+              <w:spacing w:after="0"/>
+            </w:pPr>
+            <w:r>
+              <w:rPr>
+                <w:rFonts w:ascii="Arial" w:cs="Arial" w:eastAsia="Arial" w:hAnsi="Arial"/>
+                <w:b w:val="false"/>
+                <w:bCs w:val="false"/>
+                <w:color w:val="000000"/>
+                <w:sz w:val="20"/>
+                <w:szCs w:val="20"/>
+              </w:rPr>
+              <w:t xml:space="preserve">🔴</w:t>
+            </w:r>
+          </w:p>
+        </w:tc>
+        <w:tc>
+          <w:tcPr>
+            <w:shd w:fill="auto" w:color="auto" w:val="clear"/>
+          </w:tcPr>
+          <w:p>
+            <w:pPr>
+              <w:spacing w:after="0"/>
+            </w:pPr>
+            <w:r>
+              <w:rPr>
+                <w:rFonts w:ascii="Arial" w:cs="Arial" w:eastAsia="Arial" w:hAnsi="Arial"/>
+                <w:b w:val="false"/>
+                <w:bCs w:val="false"/>
+                <w:color w:val="000000"/>
+                <w:sz w:val="20"/>
+                <w:szCs w:val="20"/>
+              </w:rPr>
+              <w:t xml:space="preserve">PENDIENTE URGENTE: (1) Rotar service_role key de Supabase (Dashboard → Settings → API → Regenerar) y actualizar config.js de la extensión Chrome. (2) Activar RLS en 7 tablas: searches, price_sources, price_snapshots, price_reference, price_match_cache, scraper_logs, palas_candidatas — añadir políticas ANTES de activar para no romper acceso legítimo.</w:t>
             </w:r>
           </w:p>
         </w:tc>
@@ -2614,7 +2682,7 @@
                 <w:sz w:val="20"/>
                 <w:szCs w:val="20"/>
               </w:rPr>
-              <w:t xml:space="preserve">Media de precios scrapeados de tiendas (recalculado por pipeline.js)</w:t>
+              <w:t xml:space="preserve">Mediana de precios scrapeados de tiendas (recalculado por pipeline.js). v5: cambiado de media a mediana para resistir outliers.</w:t>
             </w:r>
           </w:p>
         </w:tc>
@@ -3628,7 +3696,7 @@
           <w:sz w:val="20"/>
           <w:szCs w:val="20"/>
         </w:rPr>
-        <w:t xml:space="preserve">⚠️  TTL: anuncios NO vistos en el scrape actual → verificación inmediata. last_seen_at &gt; 1 día → verificación. last_seen_at &gt; 30 días → borrado automático.</w:t>
+        <w:t xml:space="preserve">⚠️  TTL: anuncios NO vistos en el scrape actual → verificación inmediata (vendidos=borrar, reservados=saltar). last_seen_at &gt; 3 días → verificar: vendidos y reservados se borran. last_seen_at &gt; 30 días → borrado automático sin verificar.</w:t>
       </w:r>
     </w:p>
     <w:p>
@@ -4425,7 +4493,7 @@
                 <w:sz w:val="20"/>
                 <w:szCs w:val="20"/>
               </w:rPr>
-              <w:t xml:space="preserve">Registro de tiendas scrapeadas. id=1 padelnuestro, id=2 padelful</w:t>
+              <w:t xml:space="preserve">Registro de tiendas scrapeadas. Slugs activos: padelnuestro, padelzoom, romasport, padelcoronado</w:t>
             </w:r>
           </w:p>
         </w:tc>
@@ -4857,7 +4925,7 @@
           <w:sz w:val="20"/>
           <w:szCs w:val="20"/>
         </w:rPr>
-        <w:t xml:space="preserve">  ↓ IDs NO vistos en este scrape → verificar API inmediatamente → borrar si vendido/404</w:t>
+        <w:t xml:space="preserve">  ↓ IDs NO vistos en este scrape → verificar API inmediatamente → borrar si vendido (404/sold flag); reservados se saltan</w:t>
       </w:r>
     </w:p>
     <w:p>
@@ -4872,7 +4940,7 @@
           <w:sz w:val="20"/>
           <w:szCs w:val="20"/>
         </w:rPr>
-        <w:t xml:space="preserve">  ↓ anuncios con last_seen_at &gt; 1 día → verificar API → borrar si vendido</w:t>
+        <w:t xml:space="preserve">  ↓ anuncios con last_seen_at &gt; 3 días → verificar API → borrar si vendido o reservado</w:t>
       </w:r>
     </w:p>
     <w:p>
@@ -5367,7 +5435,7 @@
           <w:sz w:val="22"/>
           <w:szCs w:val="22"/>
         </w:rPr>
-        <w:t xml:space="preserve">Estado 2026-05-18: ~757/1672 anuncios con pala_id (~45%). 2 ambiguos genuinos pendientes (Head Extreme Pro LTD Coello, Oxdog Pro+ duplicado en BD).</w:t>
+        <w:t xml:space="preserve">Estado 2026-05-26: ~757/1672 anuncios con pala_id (~45%). 1 ambiguo genuino pendiente (Head Extreme Pro LTD Coello). v16: colores como diferenciadores — Drive Black/Blue/Grey, Match Black/Blue/White ya distinguibles.</w:t>
       </w:r>
     </w:p>
     <w:p>
@@ -5751,7 +5819,7 @@
           <w:sz w:val="26"/>
           <w:szCs w:val="26"/>
         </w:rPr>
-        <w:t xml:space="preserve">scripts/match-pala-id.ts ← ACTUALIZADO 2026-05-18</w:t>
+        <w:t xml:space="preserve">scripts/match-pala-id.ts ← ACTUALIZADO 2026-05-26 v16</w:t>
       </w:r>
     </w:p>
     <w:p>
@@ -5792,7 +5860,7 @@
           <w:sz w:val="20"/>
           <w:szCs w:val="20"/>
         </w:rPr>
-        <w:t xml:space="preserve">PARTIAL_MATCH_THRESHOLD = 0.6</w:t>
+        <w:t xml:space="preserve">PARTIAL_MATCH_THRESHOLD = 0.6  (v16: KEEP_WORDS + TOKENS_DIFERENCIADORES incluyen colores)</w:t>
       </w:r>
     </w:p>
     <w:p>
@@ -5994,7 +6062,7 @@
           <w:sz w:val="26"/>
           <w:szCs w:val="26"/>
         </w:rPr>
-        <w:t xml:space="preserve">scripts/scrape-wallapop.ts ← ACTUALIZADO 2026-05-16/17</w:t>
+        <w:t xml:space="preserve">scripts/scrape-wallapop.ts ← ACTUALIZADO 2026-05-26 (sesión 2)</w:t>
       </w:r>
     </w:p>
     <w:p>
@@ -6007,7 +6075,7 @@
           <w:sz w:val="22"/>
           <w:szCs w:val="22"/>
         </w:rPr>
-        <w:t xml:space="preserve">GitHub Actions cron cada hora a :00. Verificación agresiva de vendidos. Llama a matchPalaIds() al final. TTL verificación: 1 día. Borrado a 30 días.</w:t>
+        <w:t xml:space="preserve">GitHub Actions cron cada hora a :00. Verificación agresiva: vendidos borran inmediatamente, reservados con margen 3 días. Bloque stale ampliado a 3 días (borra vendidos y reservados caducados). Llama a matchPalaIds() al final. Borrado TTL 30 días.</w:t>
       </w:r>
     </w:p>
     <w:p>
@@ -6194,7 +6262,7 @@
           <w:sz w:val="22"/>
           <w:szCs w:val="22"/>
         </w:rPr>
-        <w:t xml:space="preserve">recalculatePriceReference() — snapshots últimas 24h. Escribe en price_reference Y actualiza palas.precio_referencia y palas.precio_minimo_tiendas.</w:t>
+        <w:t xml:space="preserve">recalculatePriceReference() — snapshots últimos 30 días, deduplicados por url_producto. Escribe en price_reference Y actualiza palas.precio_referencia y palas.precio_minimo_tiendas.</w:t>
       </w:r>
     </w:p>
     <w:p>
@@ -6211,7 +6279,9 @@
           <w:sz w:val="20"/>
           <w:szCs w:val="20"/>
         </w:rPr>
-        <w:t xml:space="preserve">⚠️  Bug conocido: price_reference no rellena palas descatalogadas. Fix pendiente (Tarea A).</w:t>
+        <w:t xml:space="preserve">✅ v6 (2026-05-26): (1) checkUrlDisponible() — HEAD request a cada URL tras scrape; si 404 o redirect a URL distinta → disponible=false en price_snapshots. Elimina URLs rotas de descatalogados de forma automática y permanente. (2) fuzzyMatch() recibe ahora productUrl como segundo argumento — señales de URL tienen prioridad sobre título. (3) getFromCache() lee producto_titulo; si difiere del título actual → caché invalidada, se rematchea. DELETE price_match_cache recomendado tras deploy.
+✅ v5 (2026-05-26): precio_referencia usa MEDIANA en lugar de media aritmética — resiste outliers (Roma Sport 280€ ya no infla la referencia). Script recalculate-all-references.js para aplicar a todos los precios existentes.
+✅ v4 (2026-05-25): insertSnapshot usa .limit(1) en lugar de .maybeSingle() — fix PGRST116 con duplicados. Ventana precio_referencia: 24h → 30 días. Filtro de packs antes de matching.</w:t>
       </w:r>
     </w:p>
     <w:p>
@@ -6967,7 +7037,7 @@
                 <w:sz w:val="20"/>
                 <w:szCs w:val="20"/>
               </w:rPr>
-              <w:t xml:space="preserve">pipeline.js recalcula solo con snapshots últimas 24h. Fix: ampliar ventana a 30 días en recalculatePriceReference().</w:t>
+              <w:t xml:space="preserve">✅ HECHO 2026-05-25. pipeline.js v4: ventana 30 días, fix .limit(1) anti-duplicados, filtro packs.</w:t>
             </w:r>
           </w:p>
         </w:tc>
@@ -7035,7 +7105,7 @@
                 <w:sz w:val="20"/>
                 <w:szCs w:val="20"/>
               </w:rPr>
-              <w:t xml:space="preserve">Borrar duplicado en tabla palas: modelo ILIKE '%Ultimate Pro+%' AND año = 2026. Luego el ambiguo Oxdog se resuelve solo.</w:t>
+              <w:t xml:space="preserve">✅ HECHO 2026-05-25. No había duplicado — solo 1 fila en BD. Ambiguo resuelto.</w:t>
             </w:r>
           </w:p>
         </w:tc>
@@ -7825,7 +7895,7 @@
                 <w:sz w:val="20"/>
                 <w:szCs w:val="20"/>
               </w:rPr>
-              <w:t xml:space="preserve">fuzzy-matcher.js (pipeline tiendas) no tiene penalización de versión. Añadir extraerCodigoModelo() y penalización ×0.80.</w:t>
+              <w:t xml:space="preserve">✅ HECHO 2026-05-26 (v3+v4+v5). v3: orden desempates corregido (diferenciadores ANTES de especificidad — fix Adipower Team, Arrow Hit Carbon). v4: colores como diferenciadores (Drive Black vs Drive Blue). v5: fuzzyMatch(title, url) — señales de año y versión extraídas de la URL del producto (extraerAnioDeUrl, extraerVersionDeUrl). Neuron-25→2025, Drive-3-3→v3.3. Todos los fixes verificados con test-fixes-v6.js (9/9 ✅).</w:t>
             </w:r>
           </w:p>
         </w:tc>
@@ -8341,6 +8411,276 @@
           </w:p>
         </w:tc>
       </w:tr>
+      <w:tr>
+        <w:trPr>
+          <w:tblHeader w:val="false"/>
+        </w:trPr>
+        <w:tc>
+          <w:tcPr>
+            <w:shd w:fill="auto" w:color="auto" w:val="clear"/>
+          </w:tcPr>
+          <w:p>
+            <w:pPr>
+              <w:spacing w:after="0"/>
+            </w:pPr>
+            <w:r>
+              <w:rPr>
+                <w:rFonts w:ascii="Arial" w:cs="Arial" w:eastAsia="Arial" w:hAnsi="Arial"/>
+                <w:b w:val="false"/>
+                <w:bCs w:val="false"/>
+                <w:color w:val="000000"/>
+                <w:sz w:val="20"/>
+                <w:szCs w:val="20"/>
+              </w:rPr>
+              <w:t xml:space="preserve">2026-05-25</w:t>
+            </w:r>
+          </w:p>
+        </w:tc>
+        <w:tc>
+          <w:tcPr>
+            <w:shd w:fill="auto" w:color="auto" w:val="clear"/>
+          </w:tcPr>
+          <w:p>
+            <w:pPr>
+              <w:spacing w:after="0"/>
+            </w:pPr>
+            <w:r>
+              <w:rPr>
+                <w:rFonts w:ascii="Arial" w:cs="Arial" w:eastAsia="Arial" w:hAnsi="Arial"/>
+                <w:b w:val="false"/>
+                <w:bCs w:val="false"/>
+                <w:color w:val="000000"/>
+                <w:sz w:val="20"/>
+                <w:szCs w:val="20"/>
+              </w:rPr>
+              <w:t xml:space="preserve">Motor de precios: scraper Padel Coronado (114 palas, 107 matches, marcas dinámicas). pipeline.js v4: fix insertSnapshot (.limit(1) vs .maybeSingle PGRST116), dedup por url_producto, ventana precio_referencia 24h→30d, filtro packs. Limpieza BD Roma Sport (duplicados source_id=9). match-pala-id.ts v15: eliminado ‘royal’ falso positivo, añadidos Jhayber y Harlem. Verificado: 0 duplicados en price_snapshots. Precios validados: PadelNuestro 422p/152€, PadelZoom 571p/158€, Roma Sport 66p/211€, PadelCoronado 82p/178€.</w:t>
+            </w:r>
+          </w:p>
+        </w:tc>
+      </w:tr>
+      <w:tr>
+        <w:trPr>
+          <w:tblHeader w:val="false"/>
+        </w:trPr>
+        <w:tc>
+          <w:tcPr>
+            <w:shd w:fill="auto" w:color="auto" w:val="clear"/>
+          </w:tcPr>
+          <w:p>
+            <w:pPr>
+              <w:spacing w:after="0"/>
+            </w:pPr>
+            <w:r>
+              <w:rPr>
+                <w:rFonts w:ascii="Arial" w:cs="Arial" w:eastAsia="Arial" w:hAnsi="Arial"/>
+                <w:b w:val="false"/>
+                <w:bCs w:val="false"/>
+                <w:color w:val="000000"/>
+                <w:sz w:val="20"/>
+                <w:szCs w:val="20"/>
+              </w:rPr>
+              <w:t xml:space="preserve">2026-05-26</w:t>
+            </w:r>
+          </w:p>
+        </w:tc>
+        <w:tc>
+          <w:tcPr>
+            <w:shd w:fill="auto" w:color="auto" w:val="clear"/>
+          </w:tcPr>
+          <w:p>
+            <w:pPr>
+              <w:spacing w:after="0"/>
+            </w:pPr>
+            <w:r>
+              <w:rPr>
+                <w:rFonts w:ascii="Arial" w:cs="Arial" w:eastAsia="Arial" w:hAnsi="Arial"/>
+                <w:b w:val="false"/>
+                <w:bCs w:val="false"/>
+                <w:color w:val="000000"/>
+                <w:sz w:val="20"/>
+                <w:szCs w:val="20"/>
+              </w:rPr>
+              <w:t xml:space="preserve">fuzzy-matcher.js v3+v4: fix orden desempates (diferenciadores antes de especificidad) + colores como diferenciadores — Drive Black/Blue/Grey, Match Black/Blue/White ya distinguibles. pipeline.js v5: precio_referencia usa MEDIANA (fix Roma Sport outliers: 163€→75€). match-pala-id.ts v16: mismos colores añadidos a KEEP_WORDS + TOKENS_DIFERENCIADORES. SQL limpieza caché (fix-cache-colores.sql): borrar matches incorrectos de Drive/Match colores + Adipower Team/Multiweight. Script recalculate-all-references.js: recálculo masivo con mediana de todos los precios existentes.</w:t>
+            </w:r>
+          </w:p>
+        </w:tc>
+      </w:tr>
+      <w:tr>
+        <w:tc>
+          <w:tcPr>
+            <w:shd w:fill="auto" w:color="auto" w:val="clear"/>
+          </w:tcPr>
+          <w:p>
+            <w:pPr>
+              <w:spacing w:after="0"/>
+            </w:pPr>
+            <w:r>
+              <w:rPr>
+                <w:rFonts w:ascii="Arial" w:cs="Arial" w:eastAsia="Arial" w:hAnsi="Arial"/>
+                <w:b w:val="false"/>
+                <w:bCs w:val="false"/>
+                <w:color w:val="000000"/>
+                <w:sz w:val="20"/>
+                <w:szCs w:val="20"/>
+              </w:rPr>
+              <w:t xml:space="preserve">2026-05-26 (sesión 2)</w:t>
+            </w:r>
+          </w:p>
+        </w:tc>
+        <w:tc>
+          <w:tcPr>
+            <w:shd w:fill="auto" w:color="auto" w:val="clear"/>
+          </w:tcPr>
+          <w:p>
+            <w:pPr>
+              <w:spacing w:after="0"/>
+            </w:pPr>
+            <w:r>
+              <w:rPr>
+                <w:rFonts w:ascii="Arial" w:cs="Arial" w:eastAsia="Arial" w:hAnsi="Arial"/>
+                <w:b w:val="false"/>
+                <w:bCs w:val="false"/>
+                <w:color w:val="000000"/>
+                <w:sz w:val="20"/>
+                <w:szCs w:val="20"/>
+              </w:rPr>
+              <w:t xml:space="preserve">Fix keywords extensión Chrome (config.js): keywords Joma simplificados sin sufijos de variante (‘joma blast pro’→‘joma blast’, etc.) para no perder modelos como blast hrd. Añadida función validateKeywords() que avisa en consola si algún keyword termina en sufijo de variante. Fix borrado reservados/vendidos en ambos sistemas: fetchItemDetail() ahora distingue sold/reserved/active (antes sólo 404=sold). scrape-wallapop.ts: loop noVistos borra vendidos inmediatamente, salta reservados; bloque stale ampliado a 3 días (vendidos y reservados sin actividad 3d+ se borran). background.js: runVerify() borra vendidos de BD inmediatamente, ignora reservados (los gestiona el scraper); scrapeKeyword() tampoco inserta reservados.</w:t>
+            </w:r>
+          </w:p>
+        </w:tc>
+      </w:tr>
+      <w:tr>
+        <w:tc>
+          <w:tcPr>
+            <w:shd w:fill="auto" w:color="auto" w:val="clear"/>
+          </w:tcPr>
+          <w:p>
+            <w:pPr>
+              <w:spacing w:after="0"/>
+            </w:pPr>
+            <w:r>
+              <w:rPr>
+                <w:rFonts w:ascii="Arial" w:cs="Arial" w:eastAsia="Arial" w:hAnsi="Arial"/>
+                <w:b w:val="false"/>
+                <w:bCs w:val="false"/>
+                <w:color w:val="000000"/>
+                <w:sz w:val="20"/>
+                <w:szCs w:val="20"/>
+              </w:rPr>
+              <w:t xml:space="preserve">2026-05-26 (sesión 3)</w:t>
+            </w:r>
+          </w:p>
+        </w:tc>
+        <w:tc>
+          <w:tcPr>
+            <w:shd w:fill="auto" w:color="auto" w:val="clear"/>
+          </w:tcPr>
+          <w:p>
+            <w:pPr>
+              <w:spacing w:after="0"/>
+            </w:pPr>
+            <w:r>
+              <w:rPr>
+                <w:rFonts w:ascii="Arial" w:cs="Arial" w:eastAsia="Arial" w:hAnsi="Arial"/>
+                <w:b w:val="false"/>
+                <w:bCs w:val="false"/>
+                <w:color w:val="000000"/>
+                <w:sz w:val="20"/>
+                <w:szCs w:val="20"/>
+              </w:rPr>
+              <w:t xml:space="preserve">Calidad datos /chollos: 4 guardias post-query en app/api/chollos/route.ts para eliminar falsos positivos del fuzzy-matcher. Guardia A: año 4 dígitos en URL ≠ año catálogo (Viboras Coronado, Head Extreme Motion). Guardia B: sufijo -NN- en URL implica año distinto (Hack 04 Hybrid Miami 2025 ≠ 2026). Guardia C: URL compartida entre múltiples pala_ids = ambigüedad, descartar ambos (Drop Shot Axion Attack Soft/2024, XPLO Comfort 2025/2026). Guardia D: colisión de nombre conocida (counter-origin ≠ counter-veron). Limpieza BD: DELETE price_snapshots Adipower 3.2 (falso positivo caché vieja). DELETE price_match_cache completa + re-scrape para reconstruir con matcher v4. Problemas pendientes en matcher: Neuron 2024 → URL neuron-25 (SKU ambiguo), Drive Blue 2026 → URL drive-3-3 (generación incorrecta), URLs rotas en PadelNuestro (productos descatalogados que el scraper sigue guardando).</w:t>
+            </w:r>
+          </w:p>
+        </w:tc>
+      </w:tr>
+      <w:tr>
+        <w:tc>
+          <w:tcPr>
+            <w:shd w:fill="auto" w:color="auto" w:val="clear"/>
+          </w:tcPr>
+          <w:p>
+            <w:pPr>
+              <w:spacing w:after="0"/>
+            </w:pPr>
+            <w:r>
+              <w:rPr>
+                <w:rFonts w:ascii="Arial" w:cs="Arial" w:eastAsia="Arial" w:hAnsi="Arial"/>
+                <w:b w:val="false"/>
+                <w:bCs w:val="false"/>
+                <w:color w:val="000000"/>
+                <w:sz w:val="20"/>
+                <w:szCs w:val="20"/>
+              </w:rPr>
+              <w:t xml:space="preserve">2026-05-26 (sesión 4)</w:t>
+            </w:r>
+          </w:p>
+        </w:tc>
+        <w:tc>
+          <w:tcPr>
+            <w:shd w:fill="auto" w:color="auto" w:val="clear"/>
+          </w:tcPr>
+          <w:p>
+            <w:pPr>
+              <w:spacing w:after="0"/>
+            </w:pPr>
+            <w:r>
+              <w:rPr>
+                <w:rFonts w:ascii="Arial" w:cs="Arial" w:eastAsia="Arial" w:hAnsi="Arial"/>
+                <w:b w:val="false"/>
+                <w:bCs w:val="false"/>
+                <w:color w:val="000000"/>
+                <w:sz w:val="20"/>
+                <w:szCs w:val="20"/>
+              </w:rPr>
+              <w:t xml:space="preserve">Refactoring global pipeline de precios — tres fixes estructurales: (1) pipeline.js v6: verificación HTTP de URLs en price_snapshots — si 404 o redirect a página distinta, disponible=false (elimina URLs rotas de descatalogados PadelNuestro de forma permanente y automática). (2) fuzzy-matcher.js v5: enriquecimiento con URL del producto — extraerAnioDeUrl() detecta sufijos tipo -25/-26 como año (Neuron-25=2025), extraerVersionDeUrl() detecta -N-N como versión (drive-3-3=3.3); el matcher combina señales del title + URL para desempatar antes de recurrir al catálogo. (3) pipeline.js: invalidación de caché inteligente — saveToCache() guarda también product_url_path; al leer caché, si la URL del producto en caché difiere de la actual, se descarta y se rematchea (evita que matches incorrectos persistan indefinidamente). DELETE price_match_cache completa recomendado tras deploy para empezar limpio.</w:t>
+            </w:r>
+          </w:p>
+        </w:tc>
+      </w:tr>
+      <w:tr>
+        <w:tc>
+          <w:tcPr>
+            <w:shd w:fill="auto" w:color="auto" w:val="clear"/>
+          </w:tcPr>
+          <w:p>
+            <w:pPr>
+              <w:spacing w:after="0"/>
+            </w:pPr>
+            <w:r>
+              <w:rPr>
+                <w:rFonts w:ascii="Arial" w:cs="Arial" w:eastAsia="Arial" w:hAnsi="Arial"/>
+                <w:b w:val="false"/>
+                <w:bCs w:val="false"/>
+                <w:color w:val="000000"/>
+                <w:sz w:val="20"/>
+                <w:szCs w:val="20"/>
+              </w:rPr>
+              <w:t xml:space="preserve">2026-05-26 (sesión 5)</w:t>
+            </w:r>
+          </w:p>
+        </w:tc>
+        <w:tc>
+          <w:tcPr>
+            <w:shd w:fill="auto" w:color="auto" w:val="clear"/>
+          </w:tcPr>
+          <w:p>
+            <w:pPr>
+              <w:spacing w:after="0"/>
+            </w:pPr>
+            <w:r>
+              <w:rPr>
+                <w:rFonts w:ascii="Arial" w:cs="Arial" w:eastAsia="Arial" w:hAnsi="Arial"/>
+                <w:b w:val="false"/>
+                <w:bCs w:val="false"/>
+                <w:color w:val="000000"/>
+                <w:sz w:val="20"/>
+                <w:szCs w:val="20"/>
+              </w:rPr>
+              <w:t xml:space="preserve">Diagnóstico completo huntpadel.com (DIAGNOSTICO_HUNTPADEL.md). Problemas detectados y resueltos: (1) Basura Vinted/Wallapop — filtros italianos añadidos a background.js (scarpe, racchetta, cappellino…), borrado scarpe del TOP con SQL, filtro precio mínimo 15€ en API search. (2) Condición un_opened no mapeada — añadida en SearchPanel, wallapop.ts y alertas/page como “Nuevo (sin abrir)”. (3) Duplicados en TOP — MAX_POR_PALA_ID=1 en top-oportunidades.ts. (4) Scrapers 6 tiendas nuevas implementados — tennispoint, decathlon, padelproshop, miravia, amazon, padeliberico en scripts/prices/scrapers/ + workflow scrape-precios.yml actualizado + price_sources insertados en Supabase. (5) Imagen rota Tecnifibre Wall Master One 2023 — SQL ejecutado. Commit y push a main, Vercel desplegado. PENDIENTE SEGURIDAD: rotar service_role key Supabase + activar RLS en 7 tablas (searches, price_sources, price_snapshots, price_reference, price_match_cache, scraper_logs, palas_candidatas).</w:t>
+            </w:r>
+          </w:p>
+        </w:tc>
+      </w:tr>
     </w:tbl>
     <w:p>
       <w:pPr>
@@ -8769,7 +9109,7 @@
           <w:sz w:val="20"/>
           <w:szCs w:val="20"/>
         </w:rPr>
-        <w:t xml:space="preserve">git add scripts/match-pala-id.ts scripts/scrape-wallapop.ts scripts/scrape-vinted.ts</w:t>
+        <w:t xml:space="preserve">git add scripts/match-pala-id.ts scripts/scrape-wallapop.ts scripts/scrape-vinted.ts scripts/prices/fuzzy-matcher.js scripts/prices/pipeline.js scripts/prices/recalculate-all-references.js</w:t>
       </w:r>
     </w:p>
     <w:p>

</xml_diff>